<commit_message>
fix: replace corpus with corrected version
</commit_message>
<xml_diff>
--- a/corpus/policy_02_home_std_2024-01.docx
+++ b/corpus/policy_02_home_std_2024-01.docx
@@ -17,7 +17,7 @@
     </w:p>
     <w:p>
       <w:r>
-        <w:t>Synthetic training data for development/testing only; not a real insurance contract.</w:t>
+        <w:t>Policy Type: Homeowners Standard Policy</w:t>
       </w:r>
     </w:p>
     <w:p>
@@ -25,22 +25,91 @@
         <w:pStyle w:val="Heading1"/>
       </w:pPr>
       <w:r>
-        <w:t>1. Policy Overview</w:t>
+        <w:t>1. Declarations</w:t>
       </w:r>
     </w:p>
     <w:p>
       <w:r>
-        <w:t>The Homeowners Standard Policy provides coverage for direct physical loss to a covered dwelling and personal property therein. Coverage is subject to the definitions, limits, conditions, exclusions, and endorsements in this document.</w:t>
+        <w:t>Named Insured: as shown in the policy record. Policy Number: SC-HOME-STD-0002. Policy Period: from 2024-01-01 to 2025-01-01, 12:01 a.m. standard time at the address of the Named Insured.</w:t>
       </w:r>
     </w:p>
     <w:p>
       <w:r>
-        <w:t>Policy SC-HOME-STD-0002 is a synthetic policy record for region Coastal Bay. The policy period begins on 2024-01-01 and ends at 00:01 on 2025-01-01.</w:t>
+        <w:t>Insuring Company: Bluefield Indemnity Company, hereinafter called "the Company".</w:t>
       </w:r>
     </w:p>
     <w:p>
       <w:r>
-        <w:t>A claim must be evaluated using the policy wording and endorsements that were effective on the date of loss. A later amendment does not automatically replace wording that governed an earlier loss date.</w:t>
+        <w:t>Coverage: Homeowners Standard Policy. Territory: Coastal Bay.</w:t>
+      </w:r>
+    </w:p>
+    <w:p>
+      <w:r>
+        <w:t>Limit of Liability: $250,000 each occurrence. Deductible: $1,000 each occurrence.</w:t>
+      </w:r>
+    </w:p>
+    <w:p>
+      <w:pPr>
+        <w:pStyle w:val="Heading1"/>
+      </w:pPr>
+      <w:r>
+        <w:t>2. Insuring Agreement</w:t>
+      </w:r>
+    </w:p>
+    <w:p>
+      <w:r>
+        <w:t>In consideration of the payment of the premium and in reliance upon the statements in the Declarations, the Company agrees to provide the insurance described in this policy for direct physical loss to a covered dwelling and personal property therein, subject to the terms, conditions, limitations, and exclusions set forth herein.</w:t>
+      </w:r>
+    </w:p>
+    <w:p>
+      <w:r>
+        <w:t>This policy applies only to loss that occurs during the policy period shown in the Declarations, unless an endorsement attached to this policy states otherwise.</w:t>
+      </w:r>
+    </w:p>
+    <w:p>
+      <w:pPr>
+        <w:pStyle w:val="Heading1"/>
+      </w:pPr>
+      <w:r>
+        <w:t>3. Definitions</w:t>
+      </w:r>
+    </w:p>
+    <w:p>
+      <w:r>
+        <w:t>Throughout this policy, the words "you" and "your" refer to the Named Insured shown in the Declarations. The words "we", "us", and "our" refer to the Company providing this insurance.</w:t>
+      </w:r>
+    </w:p>
+    <w:p>
+      <w:r>
+        <w:t>"Occurrence" means an event, including continuous or repeated exposure to substantially the same general harmful conditions, which results in loss during the policy period, neither expected nor intended by the insured.</w:t>
+      </w:r>
+    </w:p>
+    <w:p>
+      <w:r>
+        <w:t>"Loss" means direct and accidental loss or damage, unless the context of the provision indicates otherwise.</w:t>
+      </w:r>
+    </w:p>
+    <w:p>
+      <w:r>
+        <w:t>"Property Damage" means physical injury to or destruction of tangible property, including the loss of use of that property.</w:t>
+      </w:r>
+    </w:p>
+    <w:p>
+      <w:pPr>
+        <w:pStyle w:val="Heading1"/>
+      </w:pPr>
+      <w:r>
+        <w:t>4. Insuring Provisions</w:t>
+      </w:r>
+    </w:p>
+    <w:p>
+      <w:r>
+        <w:t>We will pay those sums that the insured becomes legally obligated to pay, or sustains directly, as damages or loss because of direct physical loss to a covered dwelling and personal property therein, provided that the loss is caused by an occurrence within the policy period and territory stated in the Declarations.</w:t>
+      </w:r>
+    </w:p>
+    <w:p>
+      <w:r>
+        <w:t>No other obligation or liability to pay sums or perform acts or services is covered unless explicitly provided for under a Supplementary Payments provision or endorsement attached to this policy.</w:t>
       </w:r>
     </w:p>
     <w:p>
@@ -48,7 +117,7 @@
         <w:pStyle w:val="ListBullet"/>
       </w:pPr>
       <w:r>
-        <w:t>Base policy limit: $250,000.</w:t>
+        <w:t>Coverage applies only to an occurrence taking place within the policy period.</w:t>
       </w:r>
     </w:p>
     <w:p>
@@ -56,7 +125,20 @@
         <w:pStyle w:val="ListBullet"/>
       </w:pPr>
       <w:r>
-        <w:t>Standard deductible: $1,000.</w:t>
+        <w:t>The amount we will pay for loss is limited as described in the Limits of Liability section of this policy.</w:t>
+      </w:r>
+    </w:p>
+    <w:p>
+      <w:pPr>
+        <w:pStyle w:val="Heading1"/>
+      </w:pPr>
+      <w:r>
+        <w:t>5. Exclusions</w:t>
+      </w:r>
+    </w:p>
+    <w:p>
+      <w:r>
+        <w:t>This insurance does not apply to any of the following, and this list is not exhaustive of all exclusions that may be stated elsewhere in this policy or an attached endorsement:</w:t>
       </w:r>
     </w:p>
     <w:p>
@@ -64,7 +146,7 @@
         <w:pStyle w:val="ListBullet"/>
       </w:pPr>
       <w:r>
-        <w:t>Coverage applies only to eligible losses occurring within the policy period unless a specific extension states otherwise.</w:t>
+        <w:t>Loss expected or intended by any insured, or resulting from an act committed by or at the direction of any insured with intent to cause loss.</w:t>
       </w:r>
     </w:p>
     <w:p>
@@ -72,7 +154,39 @@
         <w:pStyle w:val="ListBullet"/>
       </w:pPr>
       <w:r>
-        <w:t>All limits are subject to sublimits and exclusions stated in later sections.</w:t>
+        <w:t>Loss arising out of ordinary wear and tear, gradual deterioration, inherent vice, latent defect, corrosion, rust, mold, wet or dry rot, or mechanical breakdown.</w:t>
+      </w:r>
+    </w:p>
+    <w:p>
+      <w:pPr>
+        <w:pStyle w:val="ListBullet"/>
+      </w:pPr>
+      <w:r>
+        <w:t>Loss arising out of war, including undeclared war, civil war, insurrection, rebellion, revolution, or any act or condition incident to any of the foregoing.</w:t>
+      </w:r>
+    </w:p>
+    <w:p>
+      <w:pPr>
+        <w:pStyle w:val="ListBullet"/>
+      </w:pPr>
+      <w:r>
+        <w:t>Loss arising out of the actual, alleged, or threatened discharge, dispersal, release, or escape of pollutants, unless the discharge is sudden and accidental.</w:t>
+      </w:r>
+    </w:p>
+    <w:p>
+      <w:pPr>
+        <w:pStyle w:val="ListBullet"/>
+      </w:pPr>
+      <w:r>
+        <w:t>Loss for which the insured is obligated to pay damages by reason of the assumption of liability in a contract or agreement, except to the extent liability would have attached in the absence of that contract.</w:t>
+      </w:r>
+    </w:p>
+    <w:p>
+      <w:pPr>
+        <w:pStyle w:val="ListBullet"/>
+      </w:pPr>
+      <w:r>
+        <w:t>Fraudulent, dishonest, or criminal acts by or at the direction of any insured, whether acting alone or in collusion with others.</w:t>
       </w:r>
     </w:p>
     <w:p>
@@ -80,22 +194,35 @@
         <w:pStyle w:val="Heading1"/>
       </w:pPr>
       <w:r>
-        <w:t>2. Definitions and Eligibility</w:t>
+        <w:t>6. Limits of Liability</w:t>
       </w:r>
     </w:p>
     <w:p>
       <w:r>
-        <w:t>For purposes of this policy, the insured is the person or organization listed in the policy record. The date of loss is the date on which the covered event first occurs.</w:t>
+        <w:t>Regardless of the number of insureds, claims made, or persons or organizations making claims, our total liability for all damages arising out of any one occurrence will not exceed the Limit of Liability shown in the Declarations, being $250,000.</w:t>
       </w:r>
     </w:p>
     <w:p>
       <w:r>
-        <w:t>A covered loss is an accidental, fortuitous event that falls within an insured coverage and is not removed by an applicable exclusion. A loss discovered after the event is still evaluated using the event date when that date can be established.</w:t>
+        <w:t>A deductible of $1,000 applies separately to each occurrence, and will be deducted from the amount otherwise payable before any payment is made under this policy.</w:t>
       </w:r>
     </w:p>
     <w:p>
       <w:r>
-        <w:t>An occurrence means a single event or series of closely related events arising from the same originating cause.</w:t>
+        <w:t>Payments made under any Supplementary Payments provision, if applicable, are in addition to, and not part of, the Limit of Liability.</w:t>
+      </w:r>
+    </w:p>
+    <w:p>
+      <w:pPr>
+        <w:pStyle w:val="Heading1"/>
+      </w:pPr>
+      <w:r>
+        <w:t>7. Duties in the Event of Loss</w:t>
+      </w:r>
+    </w:p>
+    <w:p>
+      <w:r>
+        <w:t>In the event of a loss to which this insurance may apply, the insured must perform the following duties as a condition precedent to coverage under this policy.</w:t>
       </w:r>
     </w:p>
     <w:p>
@@ -103,7 +230,7 @@
         <w:pStyle w:val="ListBullet"/>
       </w:pPr>
       <w:r>
-        <w:t>The insured must provide reasonable information needed to evaluate a claim.</w:t>
+        <w:t>Give prompt notice of the loss to us or our authorized agent, including how, when, and where the loss occurred.</w:t>
       </w:r>
     </w:p>
     <w:p>
@@ -111,7 +238,7 @@
         <w:pStyle w:val="ListBullet"/>
       </w:pPr>
       <w:r>
-        <w:t>Material misrepresentation, intentional concealment, or fraudulent statements may affect eligibility for payment.</w:t>
+        <w:t>Take all reasonable steps to protect covered property from further damage, and keep a record of expenses necessary to protect the property for consideration in the settlement of the claim.</w:t>
       </w:r>
     </w:p>
     <w:p>
@@ -119,7 +246,7 @@
         <w:pStyle w:val="ListBullet"/>
       </w:pPr>
       <w:r>
-        <w:t>Coverage cannot exceed the applicable policy limit or sublimit.</w:t>
+        <w:t>Permit us to inspect the property and records proving the loss before, and after, repair or replacement.</w:t>
       </w:r>
     </w:p>
     <w:p>
@@ -127,7 +254,23 @@
         <w:pStyle w:val="ListBullet"/>
       </w:pPr>
       <w:r>
-        <w:t>Where an endorsement conflicts with a base-policy provision, the endorsement controls only to the extent of the conflict.</w:t>
+        <w:t>As often as we reasonably require, provide us with records and documents we request and permit us to make copies, and submit to examination under oath.</w:t>
+      </w:r>
+    </w:p>
+    <w:p>
+      <w:pPr>
+        <w:pStyle w:val="ListBullet"/>
+      </w:pPr>
+      <w:r>
+        <w:t>Send us a signed, sworn proof of loss within sixty days after our request, setting forth the details of the occurrence, the interest of the insured, and other insurance that may cover the loss.</w:t>
+      </w:r>
+    </w:p>
+    <w:p>
+      <w:pPr>
+        <w:pStyle w:val="ListBullet"/>
+      </w:pPr>
+      <w:r>
+        <w:t>Cooperate with us in the investigation, settlement, or defense of any claim or suit.</w:t>
       </w:r>
     </w:p>
     <w:p>
@@ -135,17 +278,63 @@
         <w:pStyle w:val="Heading1"/>
       </w:pPr>
       <w:r>
-        <w:t>3. Covered Events</w:t>
+        <w:t>8. General Conditions</w:t>
       </w:r>
     </w:p>
     <w:p>
       <w:r>
-        <w:t>Subject to the deductible and applicable limits, the policy covers qualifying direct loss or eligible expense associated with direct physical loss to a covered dwelling and personal property therein.</w:t>
+        <w:t>Other Insurance. If there is other applicable insurance covering the same loss, this policy will apply only as excess over such other insurance, unless a contrary intent is expressed in an attached endorsement.</w:t>
       </w:r>
     </w:p>
     <w:p>
       <w:r>
-        <w:t>The cause of loss must be consistent with an insured event. Evidence may include invoices, photographs, incident reports, repair estimates, medical records where applicable, or other reliable documentation.</w:t>
+        <w:t>Subrogation. If any person or organization to or for whom we make payment under this policy has rights to recover damages from another, those rights are transferred to us to the extent of our payment. That person or organization must do everything necessary to secure those rights and must do nothing after loss to impair them.</w:t>
+      </w:r>
+    </w:p>
+    <w:p>
+      <w:r>
+        <w:t>Cancellation. This policy may be cancelled by the Named Insured by mailing or delivering to us advance written notice of cancellation. We may cancel this policy by mailing or delivering written notice to the Named Insured at the address shown in the Declarations, stating the effective date of cancellation.</w:t>
+      </w:r>
+    </w:p>
+    <w:p>
+      <w:r>
+        <w:t>Assignment. Interest in this policy may not be assigned without our written consent.</w:t>
+      </w:r>
+    </w:p>
+    <w:p>
+      <w:r>
+        <w:t>Concealment or Fraud. Coverage under this policy is void as to any insured who, whether before or after a loss, has intentionally concealed or misrepresented any material fact or circumstance relating to this insurance.</w:t>
+      </w:r>
+    </w:p>
+    <w:p>
+      <w:pPr>
+        <w:pStyle w:val="Heading1"/>
+      </w:pPr>
+      <w:r>
+        <w:t>9. Endorsements and Amendments</w:t>
+      </w:r>
+    </w:p>
+    <w:p>
+      <w:r>
+        <w:t>This policy, including the Declarations and any attached endorsements, constitutes the entire agreement between the insured and the Company relating to this insurance. No provision of this policy may be waived or changed except by endorsement issued by the Company and attached to this policy.</w:t>
+      </w:r>
+    </w:p>
+    <w:p>
+      <w:r>
+        <w:t>This document represents the version of the policy effective from 2024-01-01 through 2025-01-01. Where the Company issues a renewal or replacement policy, the terms of that later policy govern occurrences taking place during its own policy period, and do not alter the terms applicable to an occurrence that took place during an earlier policy period.</w:t>
+      </w:r>
+    </w:p>
+    <w:p>
+      <w:pPr>
+        <w:pStyle w:val="Heading1"/>
+      </w:pPr>
+      <w:r>
+        <w:t>10. Additional Coverage Terms</w:t>
+      </w:r>
+    </w:p>
+    <w:p>
+      <w:r>
+        <w:t>The following additional terms apply specifically to coverage for direct physical loss to a covered dwelling and personal property therein under this policy, and supplement rather than replace the general terms stated elsewhere in this policy.</w:t>
       </w:r>
     </w:p>
     <w:p>
@@ -153,7 +342,7 @@
         <w:pStyle w:val="ListBullet"/>
       </w:pPr>
       <w:r>
-        <w:t>Sudden accidental loss may be covered when it falls within the selected coverage.</w:t>
+        <w:t>Coverage is provided on the terms in effect at the time of the occurrence giving rise to the claim.</w:t>
       </w:r>
     </w:p>
     <w:p>
@@ -161,7 +350,7 @@
         <w:pStyle w:val="ListBullet"/>
       </w:pPr>
       <w:r>
-        <w:t>Reasonable emergency measures taken to prevent additional covered loss may be considered, subject to policy conditions.</w:t>
+        <w:t>Any sublimit stated in an endorsement applies in place of, and does not increase, the overall Limit of Liability stated in the Declarations.</w:t>
       </w:r>
     </w:p>
     <w:p>
@@ -169,7 +358,30 @@
         <w:pStyle w:val="ListBullet"/>
       </w:pPr>
       <w:r>
-        <w:t>Temporary expenses are covered only when the applicable coverage explicitly provides for them.</w:t>
+        <w:t>Salvage or recovered property, if any, will be credited against the amount payable under this policy.</w:t>
+      </w:r>
+    </w:p>
+    <w:p>
+      <w:pPr>
+        <w:pStyle w:val="Heading1"/>
+      </w:pPr>
+      <w:r>
+        <w:t>11. Loss Settlement</w:t>
+      </w:r>
+    </w:p>
+    <w:p>
+      <w:r>
+        <w:t>We may pay for loss in money, or repair or replace the damaged property, at our option. We reserve the right to take all or part of damaged property at the agreed or appraised value.</w:t>
+      </w:r>
+    </w:p>
+    <w:p>
+      <w:r>
+        <w:t>If we and the insured fail to agree on the amount of loss, either party may demand an appraisal. Each party will select a competent, disinterested appraiser and notify the other of the selection within twenty days of the demand. The two appraisers will select an umpire; if they cannot agree within fifteen days, either party may request selection by a judge of a court of record.</w:t>
+      </w:r>
+    </w:p>
+    <w:p>
+      <w:r>
+        <w:t>Each appraiser will separately set the amount of loss. If the appraisers submit a written report of an agreement to us, the amount agreed upon will be the amount of loss. If they fail to agree, they will submit their differences to the umpire, and a decision agreed to by any two will set the amount of loss.</w:t>
       </w:r>
     </w:p>
     <w:p>
@@ -177,7 +389,23 @@
         <w:pStyle w:val="ListBullet"/>
       </w:pPr>
       <w:r>
-        <w:t>Wear and tear, deterioration, or maintenance issues are not converted into covered losses merely because a separate accident is later reported.</w:t>
+        <w:t>Each party will pay its own chosen appraiser and bear the other appraisal expenses equally.</w:t>
+      </w:r>
+    </w:p>
+    <w:p>
+      <w:pPr>
+        <w:pStyle w:val="ListBullet"/>
+      </w:pPr>
+      <w:r>
+        <w:t>We do not waive any of our rights under this policy by engaging in the appraisal process.</w:t>
+      </w:r>
+    </w:p>
+    <w:p>
+      <w:pPr>
+        <w:pStyle w:val="ListBullet"/>
+      </w:pPr>
+      <w:r>
+        <w:t>Payment is due within the period stated in this policy after the amount of loss is established and any other applicable policy conditions are satisfied.</w:t>
       </w:r>
     </w:p>
     <w:p>
@@ -185,558 +413,27 @@
         <w:pStyle w:val="Heading1"/>
       </w:pPr>
       <w:r>
-        <w:t>4. Exclusions</w:t>
+        <w:t>12. Miscellaneous Provisions</w:t>
       </w:r>
     </w:p>
     <w:p>
       <w:r>
-        <w:t>The following exclusions apply unless an endorsement expressly restores or modifies the excluded coverage.</w:t>
-      </w:r>
-    </w:p>
-    <w:p>
-      <w:pPr>
-        <w:pStyle w:val="ListBullet"/>
-      </w:pPr>
-      <w:r>
-        <w:t>Intentional loss caused or arranged by an insured.</w:t>
-      </w:r>
-    </w:p>
-    <w:p>
-      <w:pPr>
-        <w:pStyle w:val="ListBullet"/>
-      </w:pPr>
-      <w:r>
-        <w:t>Normal wear and tear, gradual deterioration, corrosion, or maintenance defects.</w:t>
-      </w:r>
-    </w:p>
-    <w:p>
-      <w:pPr>
-        <w:pStyle w:val="ListBullet"/>
-      </w:pPr>
-      <w:r>
-        <w:t>Loss arising from illegal activity by an insured when the exclusion is applicable to the claim circumstances.</w:t>
-      </w:r>
-    </w:p>
-    <w:p>
-      <w:pPr>
-        <w:pStyle w:val="ListBullet"/>
-      </w:pPr>
-      <w:r>
-        <w:t>Loss caused solely by an excluded peril or excluded expense.</w:t>
-      </w:r>
-    </w:p>
-    <w:p>
-      <w:pPr>
-        <w:pStyle w:val="ListBullet"/>
-      </w:pPr>
-      <w:r>
-        <w:t>Loss resulting from failure to take reasonable steps to prevent foreseeable additional damage, to the extent permitted by applicable law.</w:t>
-      </w:r>
-    </w:p>
-    <w:p>
-      <w:pPr>
-        <w:pStyle w:val="ListBullet"/>
-      </w:pPr>
-      <w:r>
-        <w:t>Amounts above the applicable policy limit or sublimit.</w:t>
-      </w:r>
-    </w:p>
-    <w:p>
-      <w:pPr>
-        <w:pStyle w:val="ListBullet"/>
-      </w:pPr>
-      <w:r>
-        <w:t>Fraudulent or materially false claim information.</w:t>
-      </w:r>
-    </w:p>
-    <w:p>
-      <w:pPr>
-        <w:pStyle w:val="Heading1"/>
-      </w:pPr>
-      <w:r>
-        <w:t>5. Special Limits and Deductibles</w:t>
+        <w:t>Legal Action Against Us. No person or organization has a right under this policy to join us as a party or otherwise bring us into a suit asking for damages from an insured. No person or organization has the right to sue us on this policy unless all of its terms have been fully complied with.</w:t>
       </w:r>
     </w:p>
     <w:p>
       <w:r>
-        <w:t>The base deductible for this synthetic policy is $1,000. The deductible applies once per covered occurrence unless a coverage provision states otherwise.</w:t>
+        <w:t>Bankruptcy. Bankruptcy or insolvency of the insured or of the insured's estate does not relieve us of any of our obligations under this policy.</w:t>
       </w:r>
     </w:p>
     <w:p>
       <w:r>
-        <w:t>The overall base policy limit is $250,000. Certain categories may have lower sublimits, and a sublimit is the maximum payable for that category even if the overall limit is higher.</w:t>
-      </w:r>
-    </w:p>
-    <w:p>
-      <w:pPr>
-        <w:pStyle w:val="ListBullet"/>
-      </w:pPr>
-      <w:r>
-        <w:t>A higher deductible selected by endorsement supersedes the standard deductible.</w:t>
-      </w:r>
-    </w:p>
-    <w:p>
-      <w:pPr>
-        <w:pStyle w:val="ListBullet"/>
-      </w:pPr>
-      <w:r>
-        <w:t>Separate deductibles may apply to specifically scheduled risks when stated in an endorsement.</w:t>
-      </w:r>
-    </w:p>
-    <w:p>
-      <w:pPr>
-        <w:pStyle w:val="ListBullet"/>
-      </w:pPr>
-      <w:r>
-        <w:t>Recoverable amounts are reduced by applicable deductibles and non-covered portions.</w:t>
-      </w:r>
-    </w:p>
-    <w:p>
-      <w:pPr>
-        <w:pStyle w:val="ListBullet"/>
-      </w:pPr>
-      <w:r>
-        <w:t>Payment is limited to reasonable and necessary covered amounts supported by evidence.</w:t>
-      </w:r>
-    </w:p>
-    <w:p>
-      <w:pPr>
-        <w:pStyle w:val="Heading1"/>
-      </w:pPr>
-      <w:r>
-        <w:t>6. Claims Reporting and Investigation</w:t>
+        <w:t>Currency. All limits, premiums, and other amounts under this policy are stated and payable in the currency shown in the Declarations.</w:t>
       </w:r>
     </w:p>
     <w:p>
       <w:r>
-        <w:t>The insured should notify the insurer promptly after discovering a potential loss. Notice should identify the policy, date and location of loss, known circumstances, and the type of loss or expense claimed.</w:t>
-      </w:r>
-    </w:p>
-    <w:p>
-      <w:r>
-        <w:t>The insurer may request supporting documents and may inspect the loss or obtain additional evidence. Cooperation is a condition of claim handling to the extent allowed by applicable law.</w:t>
-      </w:r>
-    </w:p>
-    <w:p>
-      <w:r>
-        <w:t>The adjuster should record material evidence and the reasoning used to reach a recommendation. If evidence is incomplete, the claim should be marked for additional information rather than assuming missing facts.</w:t>
-      </w:r>
-    </w:p>
-    <w:p>
-      <w:pPr>
-        <w:pStyle w:val="ListBullet"/>
-      </w:pPr>
-      <w:r>
-        <w:t>Record the date of loss separately from the date the claim was reported.</w:t>
-      </w:r>
-    </w:p>
-    <w:p>
-      <w:pPr>
-        <w:pStyle w:val="ListBullet"/>
-      </w:pPr>
-      <w:r>
-        <w:t>Preserve source documents used to support a material coverage conclusion.</w:t>
-      </w:r>
-    </w:p>
-    <w:p>
-      <w:pPr>
-        <w:pStyle w:val="ListBullet"/>
-      </w:pPr>
-      <w:r>
-        <w:t>Identify the policy version selected for the loss date.</w:t>
-      </w:r>
-    </w:p>
-    <w:p>
-      <w:pPr>
-        <w:pStyle w:val="ListBullet"/>
-      </w:pPr>
-      <w:r>
-        <w:t>Record unresolved questions and route them to the appropriate human reviewer.</w:t>
-      </w:r>
-    </w:p>
-    <w:p>
-      <w:pPr>
-        <w:pStyle w:val="Heading1"/>
-      </w:pPr>
-      <w:r>
-        <w:t>7. Claim Evaluation Guidance</w:t>
-      </w:r>
-    </w:p>
-    <w:p>
-      <w:r>
-        <w:t>Claim evaluation should follow a traceable sequence: identify the loss date, select the policy version applicable on that date, identify the relevant coverage, check exclusions and limits, and document the evidence supporting the recommendation.</w:t>
-      </w:r>
-    </w:p>
-    <w:p>
-      <w:r>
-        <w:t>A recommendation is not a final payment decision. Finalized decisions remain under human control and must be recorded through the approval workflow.</w:t>
-      </w:r>
-    </w:p>
-    <w:p>
-      <w:pPr>
-        <w:pStyle w:val="ListBullet"/>
-      </w:pPr>
-      <w:r>
-        <w:t>Do not treat a retrieved document snippet as authoritative without checking its policy version and source metadata.</w:t>
-      </w:r>
-    </w:p>
-    <w:p>
-      <w:pPr>
-        <w:pStyle w:val="ListBullet"/>
-      </w:pPr>
-      <w:r>
-        <w:t>When two documents appear inconsistent, prefer the version whose effective period covers the loss date, subject to endorsements and supersession rules.</w:t>
-      </w:r>
-    </w:p>
-    <w:p>
-      <w:pPr>
-        <w:pStyle w:val="ListBullet"/>
-      </w:pPr>
-      <w:r>
-        <w:t>Escalate ambiguity when the available evidence cannot establish a reliable coverage conclusion.</w:t>
-      </w:r>
-    </w:p>
-    <w:p>
-      <w:pPr>
-        <w:pStyle w:val="Heading1"/>
-      </w:pPr>
-      <w:r>
-        <w:t>8. Amendments and Policy Versioning</w:t>
-      </w:r>
-    </w:p>
-    <w:p>
-      <w:r>
-        <w:t>This policy may be amended by endorsements or renewal versions. Each version has an effective date. For a claim with loss date D, the applicable version is the version whose effective period covers D, subject to explicit retroactive wording.</w:t>
-      </w:r>
-    </w:p>
-    <w:p>
-      <w:r>
-        <w:t>For policy SC-HOME-STD-0002, the base version represented by this document is effective from 2024-01-01 through 2025-01-01.</w:t>
-      </w:r>
-    </w:p>
-    <w:p>
-      <w:pPr>
-        <w:pStyle w:val="ListBullet"/>
-      </w:pPr>
-      <w:r>
-        <w:t>Always store policy version identifiers with retrieved policy evidence.</w:t>
-      </w:r>
-    </w:p>
-    <w:p>
-      <w:pPr>
-        <w:pStyle w:val="ListBullet"/>
-      </w:pPr>
-      <w:r>
-        <w:t>Use the loss date as the primary temporal key when selecting a version.</w:t>
-      </w:r>
-    </w:p>
-    <w:p>
-      <w:pPr>
-        <w:pStyle w:val="ListBullet"/>
-      </w:pPr>
-      <w:r>
-        <w:t>If no valid version can be identified, raise a policy-version-not-found condition for human review.</w:t>
-      </w:r>
-    </w:p>
-    <w:p>
-      <w:pPr>
-        <w:pStyle w:val="ListBullet"/>
-      </w:pPr>
-      <w:r>
-        <w:t>Endorsements should reference the base policy version they modify.</w:t>
-      </w:r>
-    </w:p>
-    <w:p>
-      <w:pPr>
-        <w:pStyle w:val="Heading1"/>
-      </w:pPr>
-      <w:r>
-        <w:t>9. Records, Audit, and Data Handling</w:t>
-      </w:r>
-    </w:p>
-    <w:p>
-      <w:r>
-        <w:t>Claim handling records should identify who performed a material action and when it occurred. The system should retain enough context to reproduce the reasoning path used for a recommendation.</w:t>
-      </w:r>
-    </w:p>
-    <w:p>
-      <w:r>
-        <w:t>Sensitive customer information should be exposed only to users authorized for the relevant claim and policy data. Access outside this scope should be logged and reviewed periodically.</w:t>
-      </w:r>
-    </w:p>
-    <w:p>
-      <w:r>
-        <w:t>Audit records for this policy line are retained for a minimum of seven years from the date of policy expiry, or longer where required by applicable regulation.</w:t>
-      </w:r>
-    </w:p>
-    <w:p>
-      <w:pPr>
-        <w:pStyle w:val="ListBullet"/>
-      </w:pPr>
-      <w:r>
-        <w:t>Record claim, policy, and policy-version identifiers in audit events where applicable.</w:t>
-      </w:r>
-    </w:p>
-    <w:p>
-      <w:pPr>
-        <w:pStyle w:val="ListBullet"/>
-      </w:pPr>
-      <w:r>
-        <w:t>Record approval decisions separately from AI-generated recommendations.</w:t>
-      </w:r>
-    </w:p>
-    <w:p>
-      <w:pPr>
-        <w:pStyle w:val="ListBullet"/>
-      </w:pPr>
-      <w:r>
-        <w:t>Do not treat model output as a substitute for an approval record.</w:t>
-      </w:r>
-    </w:p>
-    <w:p>
-      <w:pPr>
-        <w:pStyle w:val="ListBullet"/>
-      </w:pPr>
-      <w:r>
-        <w:t>Use least-privilege access for claim and policy information.</w:t>
-      </w:r>
-    </w:p>
-    <w:p>
-      <w:pPr>
-        <w:pStyle w:val="Heading1"/>
-      </w:pPr>
-      <w:r>
-        <w:t>10. Operational Reference</w:t>
-      </w:r>
-    </w:p>
-    <w:p>
-      <w:r>
-        <w:t>This section provides compact reference rules for retrieval evaluation. The statements are synthetic and intentionally explicit so a retrieval system can distinguish coverage, exclusions, limits, and versioning rules.</w:t>
-      </w:r>
-    </w:p>
-    <w:p>
-      <w:pPr>
-        <w:pStyle w:val="ListBullet"/>
-      </w:pPr>
-      <w:r>
-        <w:t>Policy ID: SC-HOME-STD-0002.</w:t>
-      </w:r>
-    </w:p>
-    <w:p>
-      <w:pPr>
-        <w:pStyle w:val="ListBullet"/>
-      </w:pPr>
-      <w:r>
-        <w:t>Applicable base version start: 2024-01-01.</w:t>
-      </w:r>
-    </w:p>
-    <w:p>
-      <w:pPr>
-        <w:pStyle w:val="ListBullet"/>
-      </w:pPr>
-      <w:r>
-        <w:t>Applicable base version end: 2025-01-01.</w:t>
-      </w:r>
-    </w:p>
-    <w:p>
-      <w:pPr>
-        <w:pStyle w:val="ListBullet"/>
-      </w:pPr>
-      <w:r>
-        <w:t>Base deductible: $1,000.</w:t>
-      </w:r>
-    </w:p>
-    <w:p>
-      <w:pPr>
-        <w:pStyle w:val="ListBullet"/>
-      </w:pPr>
-      <w:r>
-        <w:t>Base policy limit: $250,000.</w:t>
-      </w:r>
-    </w:p>
-    <w:p>
-      <w:pPr>
-        <w:pStyle w:val="ListBullet"/>
-      </w:pPr>
-      <w:r>
-        <w:t>Loss-date rule: use the policy version effective on the date of loss.</w:t>
-      </w:r>
-    </w:p>
-    <w:p>
-      <w:pPr>
-        <w:pStyle w:val="ListBullet"/>
-      </w:pPr>
-      <w:r>
-        <w:t>Approval rule: an AI recommendation is not a finalized claim decision.</w:t>
-      </w:r>
-    </w:p>
-    <w:p>
-      <w:pPr>
-        <w:pStyle w:val="ListBullet"/>
-      </w:pPr>
-      <w:r>
-        <w:t>Evidence rule: material recommendations should be grounded in identifiable policy or claim evidence.</w:t>
-      </w:r>
-    </w:p>
-    <w:p>
-      <w:pPr>
-        <w:pStyle w:val="ListBullet"/>
-      </w:pPr>
-      <w:r>
-        <w:t>Escalation rule: unresolved policy-version ambiguity should be sent for human review.</w:t>
-      </w:r>
-    </w:p>
-    <w:p>
-      <w:pPr>
-        <w:pStyle w:val="Heading1"/>
-      </w:pPr>
-      <w:r>
-        <w:t>11. Synthetic Evaluation Notes</w:t>
-      </w:r>
-    </w:p>
-    <w:p>
-      <w:r>
-        <w:t>This document is intentionally one member of a larger synthetic corpus. Other documents may contain different limits, dates, product types, exclusions, or amendments. A retrieval system should use document metadata and policy dates rather than relying only on lexical similarity.</w:t>
-      </w:r>
-    </w:p>
-    <w:p>
-      <w:r>
-        <w:t>The corpus is designed to support testing of document ingestion, chunking, embeddings, hybrid retrieval, policy-version selection, grounded answers, citations, and human approval workflows.</w:t>
-      </w:r>
-    </w:p>
-    <w:p>
-      <w:r>
-        <w:t>Where two versions of the same policy type appear in the corpus, a query naming a specific loss date should retrieve the version whose effective period covers that date, not simply the most recently ingested document.</w:t>
-      </w:r>
-    </w:p>
-    <w:p>
-      <w:pPr>
-        <w:pStyle w:val="Heading1"/>
-      </w:pPr>
-      <w:r>
-        <w:t>12. Endorsement Schedule</w:t>
-      </w:r>
-    </w:p>
-    <w:p>
-      <w:r>
-        <w:t>The following endorsements may apply to this policy where separately purchased and listed on the declarations page. Each endorsement modifies the base policy only to the extent stated in its own wording.</w:t>
-      </w:r>
-    </w:p>
-    <w:p>
-      <w:pPr>
-        <w:pStyle w:val="ListBullet"/>
-      </w:pPr>
-      <w:r>
-        <w:t>Endorsement A1 — Increased Limit: raises the base policy limit by up to 50 percent for an additional premium, subject to underwriting approval.</w:t>
-      </w:r>
-    </w:p>
-    <w:p>
-      <w:pPr>
-        <w:pStyle w:val="ListBullet"/>
-      </w:pPr>
-      <w:r>
-        <w:t>Endorsement A2 — Reduced Deductible: lowers the standard deductible for scheduled risks identified in the endorsement schedule.</w:t>
-      </w:r>
-    </w:p>
-    <w:p>
-      <w:pPr>
-        <w:pStyle w:val="ListBullet"/>
-      </w:pPr>
-      <w:r>
-        <w:t>Endorsement A3 — Extended Reporting Period: extends the notice window for reporting a loss beyond the standard reporting requirement.</w:t>
-      </w:r>
-    </w:p>
-    <w:p>
-      <w:pPr>
-        <w:pStyle w:val="ListBullet"/>
-      </w:pPr>
-      <w:r>
-        <w:t>Endorsement A4 — Named Peril Addition: adds a specifically named peril to covered events that would otherwise fall under a general exclusion.</w:t>
-      </w:r>
-    </w:p>
-    <w:p>
-      <w:pPr>
-        <w:pStyle w:val="ListBullet"/>
-      </w:pPr>
-      <w:r>
-        <w:t>Endorsement A5 — Waiver of Subrogation: waives the insurer's right to recover from a third party in specified circumstances.</w:t>
-      </w:r>
-    </w:p>
-    <w:p>
-      <w:pPr>
-        <w:pStyle w:val="ListBullet"/>
-      </w:pPr>
-      <w:r>
-        <w:t>Endorsement A6 — Additional Insured: extends coverage to a named additional party with an insurable interest in the covered risk.</w:t>
-      </w:r>
-    </w:p>
-    <w:p>
-      <w:pPr>
-        <w:pStyle w:val="ListBullet"/>
-      </w:pPr>
-      <w:r>
-        <w:t>Endorsement A7 — Loss of Use: adds coverage for reasonable additional expenses incurred while a covered loss is being repaired or replaced.</w:t>
-      </w:r>
-    </w:p>
-    <w:p>
-      <w:pPr>
-        <w:pStyle w:val="ListBullet"/>
-      </w:pPr>
-      <w:r>
-        <w:t>Endorsement A8 — Scheduled Property Rider: lists specific high-value items covered at an agreed value rather than the standard valuation method.</w:t>
-      </w:r>
-    </w:p>
-    <w:p>
-      <w:pPr>
-        <w:pStyle w:val="Heading1"/>
-      </w:pPr>
-      <w:r>
-        <w:t>13. Glossary of Terms</w:t>
-      </w:r>
-    </w:p>
-    <w:p>
-      <w:r>
-        <w:t>Actual Cash Value — the cost to replace a covered item minus depreciation for age and condition at the time of loss.</w:t>
-      </w:r>
-    </w:p>
-    <w:p>
-      <w:r>
-        <w:t>Betterment — an improvement to the condition of property beyond its pre-loss state, the cost of which is not covered under standard repair provisions.</w:t>
-      </w:r>
-    </w:p>
-    <w:p>
-      <w:r>
-        <w:t>Endorsement — a document that amends, adds to, or removes from the coverage provided by the base policy.</w:t>
-      </w:r>
-    </w:p>
-    <w:p>
-      <w:r>
-        <w:t>Indemnity — the principle that a covered loss is compensated to restore the insured to their pre-loss financial position, without profit.</w:t>
-      </w:r>
-    </w:p>
-    <w:p>
-      <w:r>
-        <w:t>Peril — a specific cause of loss, such as fire, theft, or accidental damage, that may or may not be covered depending on the policy wording.</w:t>
-      </w:r>
-    </w:p>
-    <w:p>
-      <w:r>
-        <w:t>Proximate Cause — the dominant, effective cause of a loss when more than one cause contributes to the same occurrence.</w:t>
-      </w:r>
-    </w:p>
-    <w:p>
-      <w:r>
-        <w:t>Subrogation — the insurer's right, after paying a claim, to pursue recovery from a third party responsible for the loss.</w:t>
-      </w:r>
-    </w:p>
-    <w:p>
-      <w:r>
-        <w:t>Sublimit — a cap on coverage for a specific category of loss that is lower than the overall policy limit.</w:t>
-      </w:r>
-    </w:p>
-    <w:p>
-      <w:r>
-        <w:t>Underwriting — the process by which an insurer evaluates and prices the risk before issuing or renewing a policy.</w:t>
+        <w:t>Titles of Paragraphs. The titles of the paragraphs and sections of this policy are included solely for convenience and do not affect the interpretation or meaning of any provision.</w:t>
       </w:r>
     </w:p>
     <w:sectPr>

</xml_diff>